<commit_message>
Change 57: mock v2 feedback applied to the three documents; mock v3 with Stressor 1 revalued
Co-Authored-By: Claude Opus 5.5 <noreply@anthropic.com>
Claude-Session: https://claude.ai/code/session_01PbSZiMB1koFR46V5hQyVcy
</commit_message>
<xml_diff>
--- a/wc2024227/drafts/second-amended-9A/v2_1Oct2026_your_structure/2026-10_SECOND_AMENDED_9A_FINAL.docx
+++ b/wc2024227/drafts/second-amended-9A/v2_1Oct2026_your_structure/2026-10_SECOND_AMENDED_9A_FINAL.docx
@@ -10958,7 +10958,7 @@
           <w:sz w:val="20"/>
           <w:szCs w:val="20"/>
         </w:rPr>
-        <w:t>Which of the circumstances pleaded in Part B.2 are management action taken by or on behalf of the employer in connection with the Appellant's employment, and which are conditions in which the work had to be done?</w:t>
+        <w:t>Which of the particulars in the list of stressors, and the circumstances pleaded in Part B.2, are management action taken by or on behalf of the employer in connection with the Appellant's employment, and which are conditions in which the work had to be done?</w:t>
       </w:r>
     </w:p>
     <w:p>
@@ -10980,7 +10980,7 @@
           <w:sz w:val="20"/>
           <w:szCs w:val="20"/>
         </w:rPr>
-        <w:t>In respect of those circumstances that are management action, was that action reasonable and was it taken in a reasonable way?</w:t>
+        <w:t>In respect of each particular or circumstance that is management action, was that action reasonable and was it taken in a reasonable way?</w:t>
       </w:r>
     </w:p>
     <w:p>

</xml_diff>

<commit_message>
Change 58: Stressor 3 codes listed entry by entry for 17, 18 and 19 March 2024 from the register
Co-Authored-By: Claude Opus 5.5 <noreply@anthropic.com>
Claude-Session: https://claude.ai/code/session_01PbSZiMB1koFR46V5hQyVcy
</commit_message>
<xml_diff>
--- a/wc2024227/drafts/second-amended-9A/v2_1Oct2026_your_structure/2026-10_SECOND_AMENDED_9A_FINAL.docx
+++ b/wc2024227/drafts/second-amended-9A/v2_1Oct2026_your_structure/2026-10_SECOND_AMENDED_9A_FINAL.docx
@@ -6696,7 +6696,7 @@
           <w:sz w:val="20"/>
           <w:szCs w:val="20"/>
         </w:rPr>
-        <w:t>The shift began at 06:00, seven hours after the previous one ended. [¶ 284] The register records eleven codes that day: at 8:48 a Code Grey at the QAS triage airlock; at 9:20 a MET call to Ward 6A bed 8; at 11:31 a MET call to Ward 3DR bed 14, cancelled at 11:32; at 11:35 a Neonatal MET call to Theatre 2; at 13:09 a Neonatal MET call to Birth Suite 5; at 14:38 a MET call to Ward 3DR bed 11; at 14:45 and 14:55 Code Greys at QAS triage; and at 19:15 and 19:34 Code Greys on the ED QAS ramp. Six of those fell between 06:00 and 14:00: a Code Grey, three adult MET calls (one cancelled within a minute) and two Neonatal MET calls.</w:t>
+        <w:t>The shift began at 06:00, seven hours after the previous one ended. [¶ 284] The register records eleven codes that day: at 8:48 a Code Grey at the QAS triage airlock; at 9:20 a MET call to Ward 6A bed 8; at 11:31 a MET call to Ward 3DR bed 14, cancelled at 11:32; at 11:35 a Neonatal MET call to Theatre 2; at 13:09 a Neonatal MET call to Birth Suites 5; at 14:38 a MET call to Ward 3DR bed 11; at 14:45 and 14:55 Code Greys at QAS triage; and at 19:15 and 19:34 Code Greys on the ED QAS ramp. Six of those fell between 06:00 and 14:00: a Code Grey, three adult MET calls (one cancelled within a minute) and two Neonatal MET calls.</w:t>
       </w:r>
     </w:p>
     <w:p>
@@ -6792,7 +6792,7 @@
           <w:sz w:val="20"/>
           <w:szCs w:val="20"/>
         </w:rPr>
-        <w:t>Sick leave of 7.60 hours was taken that day. [¶ 235] The register records sixteen codes on 19 March 2024, six of them between 06:00 and 14:00: a Paediatric MET call, a simulation, and four adult MET calls, one of which, at 11:34 to Ward 2I bed 20, is annotated "CALLED VIA SWITRCHBOARD" [sic].</w:t>
+        <w:t>Sick leave of 7.60 hours was taken that day. [¶ 235] The register records sixteen entries on 19 March 2024: at 0:17 a MET call to Ward MIU bed 21; at 1:41 a Code Grey in ED Ambi Care; at 9:27 a Paediatric MET call to Ward CIU bed 16; at 10:28 a simulation MET call (adults) to Ward 7C bed 3; at 11:30 a MET call to Ward 2I bed 20; at 11:34 a MET call to the same patient, Ward 2I bed 20, annotated "CALLED VIA SWITRCHBOARD" [sic]; at 12:36 a MET call to Ward 2I bed 12; at 13:42 a MET call to Ward 3DR bed 11; at 16:28 a further MET call to Ward 3DR bed 11, cancelled at 16:29; at 16:48 a Code Grey in the ED mental health lounge; at 17:23 a further MET call to Ward 3DR bed 11; at 17:31 a Code Grey in ED Ambi Care room 2; at 18:45 a MET call to Ward 5B bed 7; at 21:28 a Code Grey in the ED mental health lounge; and at 22:25 a Code Grey at ED QAS triage. Six of those fell between 06:00 and 14:00: a Paediatric MET call, a simulation, and four adult MET calls. Ward 3DR bed 11, the subject of a MET call at 14:38 on the shift of 18 March, was the subject of further MET calls at 13:42, 16:28 and 17:23 on 19 March.</w:t>
       </w:r>
     </w:p>
     <w:p>

</xml_diff>

<commit_message>
Change 62: 1(e) states the four provisions; 3(d) joins sick leave, fatigue refusal and the agreement
Co-Authored-By: Claude Opus 5.5 <noreply@anthropic.com>
Claude-Session: https://claude.ai/code/session_01PbSZiMB1koFR46V5hQyVcy
</commit_message>
<xml_diff>
--- a/wc2024227/drafts/second-amended-9A/v2_1Oct2026_your_structure/2026-10_SECOND_AMENDED_9A_FINAL.docx
+++ b/wc2024227/drafts/second-amended-9A/v2_1Oct2026_your_structure/2026-10_SECOND_AMENDED_9A_FINAL.docx
@@ -1483,7 +1483,7 @@
           <w:sz w:val="20"/>
           <w:szCs w:val="20"/>
         </w:rPr>
-        <w:t>On 20 February 2024 the Appellant messaged the Manager that he had tested positive for COVID-19. She "requested that you send it to her so she could submit it in MyHR". [¶ 136] She had said he was eligible for up to five days' paid leave on photo evidence of the test. He sent it to her as she asked. She then asked him to submit the Special Pandemic Leave request through myHR himself and attach a statutory declaration or photo evidence of his test. [¶ 132] The myHR submissions report records the initiator of that request as the Appellant [¶¶ 140 to 141], and the Respondent does not allege that any other Switchboard employee was required to submit such a request personally through myHR in February 2024. [¶ 142] The leave request history for Process Reference 15480560 records him creating a draft at 11:24:48 that morning and submitting the request at 11:41:27. [¶¶ 114 to 115] So the material was provided to the Manager once, as requested, and then had to be submitted by him through the system: once that morning, and, after two declines, twice more.</w:t>
+        <w:t>On 20 February 2024 the Appellant messaged the Manager that he had tested positive for COVID-19. She "requested that you send it to her so she could submit it in MyHR". [¶ 136] She had said he was eligible for up to five days' paid leave on photo evidence of the test. He sent it to her as she asked. She then asked him to submit the Special Pandemic Leave request through myHR himself and attach a statutory declaration or photo evidence of his test. [¶ 132] The myHR submissions report records the initiator of that request as the Appellant [¶¶ 140 to 141], and the Respondent does not allege that any other Switchboard employee was required to submit such a request personally through myHR in February 2024. [¶ 142] The leave request history for Process Reference 15480560 records him creating a draft at 11:24:48 that morning and submitting the request at 11:41:27. [¶¶ 114 to 115] So the material was provided to the Manager once, as requested, and then had to be submitted by him through the system: once that morning, and, after two declines, twice more. It was provided four times in all: once to the Manager, and three times through myHR.</w:t>
       </w:r>
     </w:p>
     <w:p>
@@ -3597,7 +3597,7 @@
           <w:sz w:val="20"/>
           <w:szCs w:val="20"/>
         </w:rPr>
-        <w:t>So the enquiry of 8 April 2024 was answered on 1 May 2024, 23 days later, with a refusal. In between were the acknowledgment of 9 April, the escalation to Human Resources, and the Appellant's email of 24 April; no other response is alleged. [¶¶ 242 to 250]</w:t>
+        <w:t>So the enquiry of 8 April 2024 was answered on 1 May 2024, 23 days later, with a refusal. In between were the acknowledgment of 9 April, the escalation to Human Resources, and the Appellant's email of 24 April; no other response is alleged. [¶¶ 242 to 250] So the day after the consecutive shifts was recorded against the Appellant's own sick leave [¶ 235], and the Respondent says no fatigue leave was due for it [¶¶ 236 to 237]. His request of 8 April 2024 for fatigue payment was refused on 1 May 2024, 23 days later, by reference to an agreement signed at a time the Respondent does not allege the Manager held that role, and never reviewed; the Respondent does not allege that he was told, before that day, that he could end it "going forward". [¶¶ 21 to 22, 25, 242 to 250]</w:t>
       </w:r>
     </w:p>
     <w:p>

</xml_diff>